<commit_message>
feat: v2_summary 재학습 준비 + 5주차 산출물 업데이트 + ChatPage doc_summary UI 개선
- evaluate.py/train_v2_document.py: 태그+요약 포맷 평가 함수 업데이트
- convert_ai_hub_summary.py: LENGTH_BINS 조정 (500~1500), AI Hub 300건 변환
- ChatPage.jsx: doc_summary 구조화 UI (태그 배지 + 요약 텍스트)
- 5주차 산출물 docx 4건 수정 (제출일 03.11, 지용 파트 추가)
- AI Hub 요약 데이터 300건 (aihub_summary.jsonl) 추가

Co-Authored-By: Claude Opus 4.6 <noreply@anthropic.com>
</commit_message>
<xml_diff>
--- a/docs/산출물/5주차/3.모델링 및 평가_LLM 활용 소프트웨어.docx
+++ b/docs/산출물/5주차/3.모델링 및 평가_LLM 활용 소프트웨어.docx
@@ -305,7 +305,7 @@
                 <w:sz w:val="19"/>
                 <w:szCs w:val="19"/>
               </w:rPr>
-              <w:t xml:space="preserve">2026.03.05</w:t>
+              <w:t xml:space="preserve">2026.03.11</w:t>
             </w:r>
           </w:p>
         </w:tc>
@@ -901,7 +901,7 @@
           <w:sz w:val="20"/>
           <w:szCs w:val="20"/>
         </w:rPr>
-        <w:t xml:space="preserve">  ● Intent Classification: BERT 기반 분류기로 사용자 발화를 8개 카테고리로 분류 (confidence &gt; 0.85 시 라우팅)</w:t>
+        <w:t xml:space="preserve">  ● Intent Classification: BERT 기반 분류기(klue/bert-base, koelectra-base-v3, distilkobert 3종 비교)로 사용자 발화를 8개 카테고리(규정질의, 문서생성, 문서요약, 문서QA, 일정관리, 이메일, 회의, 일반대화)로 분류. 학습 데이터 2,898건 (v2 멀티 LLM 혼합 생성), confidence &gt; 0.85 시 라우팅</w:t>
       </w:r>
     </w:p>
     <w:p>
@@ -937,7 +937,7 @@
           <w:sz w:val="20"/>
           <w:szCs w:val="20"/>
         </w:rPr>
-        <w:t xml:space="preserve">  ● Document Agent: 문서 검색(doc_search), 생성(doc_generate), 요약(doc_summary), QA(doc_qa)</w:t>
+        <w:t xml:space="preserve">  ● Document Agent: 문서 검색(doc_search), 생성(doc_generate), 요약(doc_summary — 태그+요약 형식 출력), QA(doc_qa). doc_summary는 LoRA v2 재학습 (1,000건, AI Hub 300 + GPT-4o 합성 700)</w:t>
       </w:r>
     </w:p>
     <w:p>
@@ -2790,7 +2790,96 @@
           <w:sz w:val="32"/>
           <w:szCs w:val="32"/>
         </w:rPr>
-        <w:t xml:space="preserve">7. 테스트 시나리오</w:t>
+        <w:t xml:space="preserve">7. sLLM 전환 구조 (DOC_AGENT_MODE)</w:t>
+      </w:r>
+    </w:p>
+    <w:p>
+      <w:pPr>
+        <w:spacing w:after="80" w:before="0"/>
+        <w:jc w:val="left"/>
+      </w:pPr>
+      <w:r>
+        <w:rPr>
+          <w:rFonts w:ascii="맑은 고딕" w:cs="맑은 고딕" w:eastAsia="맑은 고딕" w:hAnsi="맑은 고딕"/>
+          <w:b w:val="false"/>
+          <w:bCs w:val="false"/>
+          <w:i w:val="false"/>
+          <w:iCs w:val="false"/>
+          <w:sz w:val="20"/>
+          <w:szCs w:val="20"/>
+        </w:rPr>
+        <w:t xml:space="preserve">Document Agent는 환경변수 DOC_AGENT_MODE로 LLM API(GPT/Claude)와 sLLM(vLLM+LoRA)을 전환합니다:</w:t>
+      </w:r>
+    </w:p>
+    <w:p>
+      <w:pPr>
+        <w:spacing w:after="40" w:before="0"/>
+        <w:jc w:val="left"/>
+      </w:pPr>
+      <w:r>
+        <w:rPr>
+          <w:rFonts w:ascii="맑은 고딕" w:cs="맑은 고딕" w:eastAsia="맑은 고딕" w:hAnsi="맑은 고딕"/>
+          <w:b w:val="false"/>
+          <w:bCs w:val="false"/>
+          <w:i w:val="false"/>
+          <w:iCs w:val="false"/>
+          <w:sz w:val="20"/>
+          <w:szCs w:val="20"/>
+        </w:rPr>
+        <w:t xml:space="preserve">  ● DOC_AGENT_MODE=api (기본): GPT-4o / Claude API → 외부 API 의존, 높은 품질</w:t>
+      </w:r>
+    </w:p>
+    <w:p>
+      <w:pPr>
+        <w:spacing w:after="40" w:before="0"/>
+        <w:jc w:val="left"/>
+      </w:pPr>
+      <w:r>
+        <w:rPr>
+          <w:rFonts w:ascii="맑은 고딕" w:cs="맑은 고딕" w:eastAsia="맑은 고딕" w:hAnsi="맑은 고딕"/>
+          <w:b w:val="false"/>
+          <w:bCs w:val="false"/>
+          <w:i w:val="false"/>
+          <w:iCs w:val="false"/>
+          <w:sz w:val="20"/>
+          <w:szCs w:val="20"/>
+        </w:rPr>
+        <w:t xml:space="preserve">  ● DOC_AGENT_MODE=sllm: Kanana-1.5-8B + LoRA → 온프레미스, 외부 API 불필요</w:t>
+      </w:r>
+    </w:p>
+    <w:p>
+      <w:pPr>
+        <w:spacing w:after="80" w:before="0"/>
+        <w:jc w:val="left"/>
+      </w:pPr>
+      <w:r>
+        <w:rPr>
+          <w:rFonts w:ascii="맑은 고딕" w:cs="맑은 고딕" w:eastAsia="맑은 고딕" w:hAnsi="맑은 고딕"/>
+          <w:b w:val="false"/>
+          <w:bCs w:val="false"/>
+          <w:i w:val="false"/>
+          <w:iCs w:val="false"/>
+          <w:sz w:val="20"/>
+          <w:szCs w:val="20"/>
+        </w:rPr>
+        <w:t xml:space="preserve">sLLM 모드에서는 vLLM 서버에 LoRA 어댑터(v2_generate, v2_summary)를 로드하여 문서 생성/요약을 처리합니다. 요약 출력 형식은 “태그: #태그1 #태그2 ... + 요약: 2~3문장”으로 통일됩니다.</w:t>
+      </w:r>
+    </w:p>
+    <w:p>
+      <w:pPr>
+        <w:spacing w:after="200" w:before="400"/>
+      </w:pPr>
+      <w:r>
+        <w:rPr>
+          <w:rFonts w:ascii="맑은 고딕" w:cs="맑은 고딕" w:eastAsia="맑은 고딕" w:hAnsi="맑은 고딕"/>
+          <w:b/>
+          <w:bCs/>
+          <w:i w:val="false"/>
+          <w:iCs w:val="false"/>
+          <w:sz w:val="32"/>
+          <w:szCs w:val="32"/>
+        </w:rPr>
+        <w:t xml:space="preserve">8. 테스트 시나리오</w:t>
       </w:r>
     </w:p>
     <w:p>

</xml_diff>